<commit_message>
Enhance OneViewMaintenanceMode functions to utilize active sessions and improve error messaging
- Added logic to retrieve the active OneView session and use its host if not provided.
- Updated error messages to guide users on connecting to OneView and configuring credentials.
- Improved handling of credential checks to avoid unnecessary prompts when an active session is available.
</commit_message>
<xml_diff>
--- a/docx/recent-changes.docx
+++ b/docx/recent-changes.docx
@@ -44076,6 +44076,2003 @@
     <w:bookmarkEnd w:id="173"/>
     <w:bookmarkEnd w:id="174"/>
     <w:bookmarkEnd w:id="175"/>
+    <w:bookmarkStart w:id="176" w:name="sec168"/>
+    <w:p>
+      <w:pPr>
+        <w:pStyle w:val="Heading1"/>
+      </w:pPr>
+      <w:r>
+        <w:t xml:space="preserve">─── Git SSH (agent-based) ────────────────────────────────────────────────────</w:t>
+      </w:r>
+    </w:p>
+    <w:p>
+      <w:pPr>
+        <w:pStyle w:val="FirstParagraph"/>
+      </w:pPr>
+      <w:r>
+        <w:t xml:space="preserve">$gitSshPath =</w:t>
+      </w:r>
+      <w:r>
+        <w:t xml:space="preserve"> </w:t>
+      </w:r>
+      <w:r>
+        <w:t xml:space="preserve">“$env:USERPROFILE</w:t>
+      </w:r>
+      <w:r>
+        <w:t xml:space="preserve">/bin”</w:t>
+      </w:r>
+      <w:r>
+        <w:t xml:space="preserve"> </w:t>
+      </w:r>
+      <w:r>
+        <w:t xml:space="preserve">if ($env:PATH -notlike</w:t>
+      </w:r>
+      <w:r>
+        <w:t xml:space="preserve"> </w:t>
+      </w:r>
+      <w:r>
+        <w:t xml:space="preserve">“</w:t>
+      </w:r>
+      <w:r>
+        <w:rPr>
+          <w:i/>
+          <w:iCs/>
+        </w:rPr>
+        <w:t xml:space="preserve">$gitSshPath</w:t>
+      </w:r>
+      <w:r>
+        <w:t xml:space="preserve">”</w:t>
+      </w:r>
+      <w:r>
+        <w:t xml:space="preserve">) { $env:PATH +=</w:t>
+      </w:r>
+      <w:r>
+        <w:t xml:space="preserve"> </w:t>
+      </w:r>
+      <w:r>
+        <w:t xml:space="preserve">“;$gitSshPath”</w:t>
+      </w:r>
+      <w:r>
+        <w:t xml:space="preserve"> </w:t>
+      </w:r>
+      <w:r>
+        <w:t xml:space="preserve">}</w:t>
+      </w:r>
+      <w:r>
+        <w:t xml:space="preserve"> </w:t>
+      </w:r>
+      <w:r>
+        <w:t xml:space="preserve">$env:GIT_SSH =</w:t>
+      </w:r>
+      <w:r>
+        <w:t xml:space="preserve"> </w:t>
+      </w:r>
+      <w:r>
+        <w:t xml:space="preserve">“$gitSshPath/ssh.exe”</w:t>
+      </w:r>
+      <w:r>
+        <w:t xml:space="preserve"> </w:t>
+      </w:r>
+      <w:r>
+        <w:t xml:space="preserve">Remove-Item Env:GIT_SSH_COMMAND -ErrorAction SilentlyContinue</w:t>
+      </w:r>
+    </w:p>
+    <w:bookmarkEnd w:id="176"/>
+    <w:bookmarkStart w:id="177" w:name="sec169"/>
+    <w:p>
+      <w:pPr>
+        <w:pStyle w:val="Heading1"/>
+      </w:pPr>
+      <w:r>
+        <w:t xml:space="preserve">Reuse a live agent; only start one if the socket is missing/dead.</w:t>
+      </w:r>
+    </w:p>
+    <w:p>
+      <w:pPr>
+        <w:pStyle w:val="FirstParagraph"/>
+      </w:pPr>
+      <w:r>
+        <w:t xml:space="preserve">$agentAlive = $false</w:t>
+      </w:r>
+      <w:r>
+        <w:t xml:space="preserve"> </w:t>
+      </w:r>
+      <w:r>
+        <w:t xml:space="preserve">if ($env:SSH_AUTH_SOCK -and (Test-Path $env:SSH_AUTH_SOCK))</w:t>
+      </w:r>
+      <w:r>
+        <w:t xml:space="preserve"> </w:t>
+      </w:r>
+      <w:r>
+        <w:t xml:space="preserve">{</w:t>
+      </w:r>
+      <w:r>
+        <w:t xml:space="preserve"> </w:t>
+      </w:r>
+      <w:r>
+        <w:t xml:space="preserve">&amp;</w:t>
+      </w:r>
+      <w:r>
+        <w:t xml:space="preserve"> </w:t>
+      </w:r>
+      <w:r>
+        <w:t xml:space="preserve">“$gitSshPath/ssh-add.exe”</w:t>
+      </w:r>
+      <w:r>
+        <w:t xml:space="preserve"> </w:t>
+      </w:r>
+      <w:r>
+        <w:t xml:space="preserve">-l 2&gt;$null | Out-Null</w:t>
+      </w:r>
+      <w:r>
+        <w:t xml:space="preserve"> </w:t>
+      </w:r>
+      <w:r>
+        <w:t xml:space="preserve">if ($LASTEXITCODE -eq 0) { $agentAlive = $true }</w:t>
+      </w:r>
+      <w:r>
+        <w:t xml:space="preserve"> </w:t>
+      </w:r>
+      <w:r>
+        <w:t xml:space="preserve">}</w:t>
+      </w:r>
+    </w:p>
+    <w:p>
+      <w:pPr>
+        <w:pStyle w:val="BodyText"/>
+      </w:pPr>
+      <w:r>
+        <w:t xml:space="preserve">if (-not $agentAlive)</w:t>
+      </w:r>
+      <w:r>
+        <w:t xml:space="preserve"> </w:t>
+      </w:r>
+      <w:r>
+        <w:t xml:space="preserve">{</w:t>
+      </w:r>
+      <w:r>
+        <w:t xml:space="preserve"> </w:t>
+      </w:r>
+      <w:r>
+        <w:t xml:space="preserve"># -s forks to background and prints env to stdout — MUST capture+eval,</w:t>
+      </w:r>
+      <w:r>
+        <w:t xml:space="preserve"> </w:t>
+      </w:r>
+      <w:r>
+        <w:t xml:space="preserve"># never let it hit the terminal (that’s what froze new terminals).</w:t>
+      </w:r>
+      <w:r>
+        <w:t xml:space="preserve"> </w:t>
+      </w:r>
+      <w:r>
+        <w:t xml:space="preserve">$agentOutput = &amp;</w:t>
+      </w:r>
+      <w:r>
+        <w:t xml:space="preserve"> </w:t>
+      </w:r>
+      <w:r>
+        <w:t xml:space="preserve">“$gitSshPath/ssh-agent.exe”</w:t>
+      </w:r>
+      <w:r>
+        <w:t xml:space="preserve"> </w:t>
+      </w:r>
+      <w:r>
+        <w:t xml:space="preserve">-s 2&gt;$null</w:t>
+      </w:r>
+      <w:r>
+        <w:t xml:space="preserve"> </w:t>
+      </w:r>
+      <w:r>
+        <w:t xml:space="preserve">foreach ($line in $agentOutput)</w:t>
+      </w:r>
+      <w:r>
+        <w:t xml:space="preserve"> </w:t>
+      </w:r>
+      <w:r>
+        <w:t xml:space="preserve">{</w:t>
+      </w:r>
+      <w:r>
+        <w:t xml:space="preserve"> </w:t>
+      </w:r>
+      <w:r>
+        <w:t xml:space="preserve">if ($line -match</w:t>
+      </w:r>
+      <w:r>
+        <w:t xml:space="preserve"> </w:t>
+      </w:r>
+      <w:r>
+        <w:t xml:space="preserve">‘^</w:t>
+      </w:r>
+      <w:r>
+        <w:t xml:space="preserve">(?:export</w:t>
+      </w:r>
+      <w:r>
+        <w:t xml:space="preserve">+)?(</w:t>
+      </w:r>
+      <w:r>
+        <w:t xml:space="preserve">+)=(.+)$’</w:t>
+      </w:r>
+      <w:r>
+        <w:t xml:space="preserve">)</w:t>
+      </w:r>
+      <w:r>
+        <w:t xml:space="preserve"> </w:t>
+      </w:r>
+      <w:r>
+        <w:t xml:space="preserve">{</w:t>
+      </w:r>
+      <w:r>
+        <w:t xml:space="preserve"> </w:t>
+      </w:r>
+      <w:r>
+        <w:t xml:space="preserve">$val = $matches[2].Trim().TrimEnd(</w:t>
+      </w:r>
+      <w:r>
+        <w:t xml:space="preserve">‘;’</w:t>
+      </w:r>
+      <w:r>
+        <w:t xml:space="preserve">).Trim(</w:t>
+      </w:r>
+      <w:r>
+        <w:t xml:space="preserve">“</w:t>
+      </w:r>
+      <w:r>
+        <w:t xml:space="preserve">‘</w:t>
+      </w:r>
+      <w:r>
+        <w:t xml:space="preserve">“).Trim(’”</w:t>
+      </w:r>
+      <w:r>
+        <w:t xml:space="preserve">’</w:t>
+      </w:r>
+      <w:r>
+        <w:t xml:space="preserve">)</w:t>
+      </w:r>
+      <w:r>
+        <w:t xml:space="preserve"> </w:t>
+      </w:r>
+      <w:r>
+        <w:t xml:space="preserve">if ($val) { Set-Item -Path”</w:t>
+      </w:r>
+      <w:r>
+        <w:t xml:space="preserve">Env:$($matches[1])” -Value $val -ErrorAction SilentlyContinue }</w:t>
+      </w:r>
+      <w:r>
+        <w:t xml:space="preserve"> </w:t>
+      </w:r>
+      <w:r>
+        <w:t xml:space="preserve">}</w:t>
+      </w:r>
+      <w:r>
+        <w:t xml:space="preserve"> </w:t>
+      </w:r>
+      <w:r>
+        <w:t xml:space="preserve">}</w:t>
+      </w:r>
+      <w:r>
+        <w:t xml:space="preserve"> </w:t>
+      </w:r>
+      <w:r>
+        <w:t xml:space="preserve">}</w:t>
+      </w:r>
+    </w:p>
+    <w:p>
+      <w:pPr>
+        <w:pStyle w:val="BodyText"/>
+      </w:pPr>
+      <w:r>
+        <w:t xml:space="preserve">Set-MaintenanceMode 0 1s 5ms 10:50:51 </w:t>
+      </w:r>
+      <w:r>
+        <w:t xml:space="preserve"> </w:t>
+      </w:r>
+      <w:r>
+        <w:t xml:space="preserve">Name Value</w:t>
+      </w:r>
+      <w:r>
+        <w:t xml:space="preserve"> </w:t>
+      </w:r>
+      <w:r>
+        <w:t xml:space="preserve">—- —–</w:t>
+      </w:r>
+      <w:r>
+        <w:t xml:space="preserve"> </w:t>
+      </w:r>
+      <w:r>
+        <w:t xml:space="preserve">Error Mode is required and must be either</w:t>
+      </w:r>
+      <w:r>
+        <w:t xml:space="preserve"> </w:t>
+      </w:r>
+      <w:r>
+        <w:t xml:space="preserve">‘scom’</w:t>
+      </w:r>
+      <w:r>
+        <w:t xml:space="preserve"> </w:t>
+      </w:r>
+      <w:r>
+        <w:t xml:space="preserve">or</w:t>
+      </w:r>
+      <w:r>
+        <w:t xml:space="preserve"> </w:t>
+      </w:r>
+      <w:r>
+        <w:t xml:space="preserve">‘oneview’</w:t>
+      </w:r>
+      <w:r>
+        <w:t xml:space="preserve">.</w:t>
+      </w:r>
+      <w:r>
+        <w:t xml:space="preserve"> </w:t>
+      </w:r>
+      <w:r>
+        <w:t xml:space="preserve">Success False</w:t>
+      </w:r>
+    </w:p>
+    <w:p>
+      <w:pPr>
+        <w:pStyle w:val="BodyText"/>
+      </w:pPr>
+      <w:r>
+        <w:t xml:space="preserve">  image-build-automation main pwsh -File ./src/powershell/Automation/Public/Set-MaintenanceMode.ps1 -Action enable -TargetId</w:t>
+      </w:r>
+      <w:r>
+        <w:t xml:space="preserve"> </w:t>
+      </w:r>
+      <w:r>
+        <w:t xml:space="preserve">‘PROD-CLUSTER-01’</w:t>
+      </w:r>
+      <w:r>
+        <w:t xml:space="preserve"> </w:t>
+      </w:r>
+      <w:r>
+        <w:t xml:space="preserve">-Mode scom -DryRun^C 10:50:58   image-build-automation main Set-MaintenanceMode -Action enable -Mode oneview -SerialNumber CZ22420JCM 0 10:52:08 Enter OneView username:</w:t>
+      </w:r>
+      <w:r>
+        <w:t xml:space="preserve"> </w:t>
+      </w:r>
+      <w:r>
+        <w:t xml:space="preserve">adm_98253</w:t>
+      </w:r>
+      <w:r>
+        <w:t xml:space="preserve"> </w:t>
+      </w:r>
+      <w:r>
+        <w:t xml:space="preserve">Enter OneView password: ***************</w:t>
+      </w:r>
+    </w:p>
+    <w:tbl>
+      <w:tblPr>
+        <w:tblStyle w:val="Table"/>
+        <w:tblW w:type="auto" w:w="0"/>
+        <w:tblLook w:firstRow="1" w:lastRow="0" w:firstColumn="0" w:lastColumn="0" w:noHBand="0" w:noVBand="0" w:val="0020"/>
+        <w:tblBorders>
+          <w:top w:val="single" w:sz="6" w:space="0" w:color="808080"/>
+          <w:left w:val="single" w:sz="6" w:space="0" w:color="808080"/>
+          <w:bottom w:val="single" w:sz="6" w:space="0" w:color="808080"/>
+          <w:right w:val="single" w:sz="6" w:space="0" w:color="808080"/>
+          <w:insideH w:val="single" w:sz="6" w:space="0" w:color="808080"/>
+          <w:insideV w:val="single" w:sz="6" w:space="0" w:color="808080"/>
+        </w:tblBorders>
+      </w:tblPr>
+      <w:tblGrid>
+        <w:gridCol w:w="3960"/>
+        <w:gridCol w:w="3960"/>
+      </w:tblGrid>
+      <w:tr>
+        <w:trPr>
+          <w:tblHeader w:val="on"/>
+        </w:trPr>
+        <w:tc>
+          <w:tcPr/>
+          <w:p>
+            <w:pPr>
+              <w:pStyle w:val="Compact"/>
+            </w:pPr>
+            <w:r>
+              <w:t xml:space="preserve">Name</w:t>
+            </w:r>
+          </w:p>
+        </w:tc>
+        <w:tc>
+          <w:tcPr/>
+          <w:p>
+            <w:pPr>
+              <w:pStyle w:val="Compact"/>
+            </w:pPr>
+            <w:r>
+              <w:t xml:space="preserve">Value</w:t>
+            </w:r>
+          </w:p>
+        </w:tc>
+      </w:tr>
+      <w:tr>
+        <w:tc>
+          <w:tcPr/>
+          <w:p>
+            <w:pPr>
+              <w:pStyle w:val="Compact"/>
+            </w:pPr>
+            <w:r>
+              <w:t xml:space="preserve">Success</w:t>
+            </w:r>
+          </w:p>
+        </w:tc>
+        <w:tc>
+          <w:tcPr/>
+          <w:p>
+            <w:pPr>
+              <w:pStyle w:val="Compact"/>
+            </w:pPr>
+            <w:r>
+              <w:t xml:space="preserve">False</w:t>
+            </w:r>
+          </w:p>
+        </w:tc>
+      </w:tr>
+      <w:tr>
+        <w:tc>
+          <w:tcPr/>
+          <w:p>
+            <w:pPr>
+              <w:pStyle w:val="Compact"/>
+            </w:pPr>
+            <w:r>
+              <w:t xml:space="preserve">Error</w:t>
+            </w:r>
+          </w:p>
+        </w:tc>
+        <w:tc>
+          <w:tcPr/>
+          <w:p>
+            <w:pPr>
+              <w:pStyle w:val="Compact"/>
+            </w:pPr>
+            <w:r>
+              <w:t xml:space="preserve">OneView could not resolve server with serial number</w:t>
+            </w:r>
+            <w:r>
+              <w:t xml:space="preserve"> </w:t>
+            </w:r>
+            <w:r>
+              <w:t xml:space="preserve">‘CZ22420JCM’</w:t>
+            </w:r>
+            <w:r>
+              <w:t xml:space="preserve">: Resolve by serial failed: No such host is known. (oneview.ad.example.com:443)</w:t>
+            </w:r>
+          </w:p>
+        </w:tc>
+      </w:tr>
+      <w:tr>
+        <w:tc>
+          <w:tcPr/>
+          <w:p>
+            <w:pPr>
+              <w:pStyle w:val="Compact"/>
+            </w:pPr>
+            <w:r>
+              <w:t xml:space="preserve">SerialNumber</w:t>
+            </w:r>
+          </w:p>
+        </w:tc>
+        <w:tc>
+          <w:tcPr/>
+          <w:p>
+            <w:pPr>
+              <w:pStyle w:val="Compact"/>
+            </w:pPr>
+            <w:r>
+              <w:t xml:space="preserve">CZ22420JCM</w:t>
+            </w:r>
+          </w:p>
+        </w:tc>
+      </w:tr>
+    </w:tbl>
+    <w:p>
+      <w:pPr>
+        <w:pStyle w:val="BodyText"/>
+      </w:pPr>
+      <w:r>
+        <w:t xml:space="preserve">  image-build-automation main Enable-OneViewMaintenanceMode -TargetId alp-qlikview-03ilo -OneViewHost va-oneviewt-01 0 26s 931ms 10:53:17 Enable-OneViewMaintenanceMode: OneView credentials are not configured for appliance</w:t>
+      </w:r>
+      <w:r>
+        <w:t xml:space="preserve"> </w:t>
+      </w:r>
+      <w:r>
+        <w:t xml:space="preserve">‘va-oneviewt-01’</w:t>
+      </w:r>
+      <w:r>
+        <w:t xml:space="preserve">. Set the ONEVIEW_USER / ONEVIEW_PASSWORD environment variables, or populate the credentials block of oneview_config.json.</w:t>
+      </w:r>
+      <w:r>
+        <w:t xml:space="preserve"> </w:t>
+      </w:r>
+      <w:r>
+        <w:t xml:space="preserve">  image-build-automation main $ONEVIEW_USER=</w:t>
+      </w:r>
+      <w:r>
+        <w:t xml:space="preserve">“adm_98253”</w:t>
+      </w:r>
+      <w:r>
+        <w:t xml:space="preserve"> </w:t>
+      </w:r>
+      <w:r>
+        <w:t xml:space="preserve">1 519ms 10:54:26   image-build-automation main $ONEVIEW_PASSWORD=</w:t>
+      </w:r>
+      <w:r>
+        <w:t xml:space="preserve">“CribCussRev89a$$”</w:t>
+      </w:r>
+      <w:r>
+        <w:t xml:space="preserve"> </w:t>
+      </w:r>
+      <w:r>
+        <w:t xml:space="preserve">0 10:58:13   image-build-automation main Enable-OneViewMaintenanceMode -TargetId alp-qlikview-03ilo -OneViewHost va-oneviewt-01 0 10:59:05 Enable-OneViewMaintenanceMode: OneView credentials are not configured for appliance</w:t>
+      </w:r>
+      <w:r>
+        <w:t xml:space="preserve"> </w:t>
+      </w:r>
+      <w:r>
+        <w:t xml:space="preserve">‘va-oneviewt-01’</w:t>
+      </w:r>
+      <w:r>
+        <w:t xml:space="preserve">. Set the ONEVIEW_USER / ONEVIEW_PASSWORD environment variables, or populate the credentials block of oneview_config.json.</w:t>
+      </w:r>
+      <w:r>
+        <w:t xml:space="preserve"> </w:t>
+      </w:r>
+      <w:r>
+        <w:t xml:space="preserve">  image-build-automation main $env:ONEVIEW_USER=</w:t>
+      </w:r>
+      <w:r>
+        <w:t xml:space="preserve">“adm_98253”</w:t>
+      </w:r>
+      <w:r>
+        <w:t xml:space="preserve"> </w:t>
+      </w:r>
+      <w:r>
+        <w:t xml:space="preserve">1 5s 140ms 10:59:14   image-build-automation main $env:ONEVIEW_PASSWORD=</w:t>
+      </w:r>
+      <w:r>
+        <w:t xml:space="preserve">“CribCussRev89a$$”</w:t>
+      </w:r>
+      <w:r>
+        <w:t xml:space="preserve"> </w:t>
+      </w:r>
+      <w:r>
+        <w:t xml:space="preserve">0 10:59:29   image-build-automation main Enable-OneViewMaintenanceMode -TargetId alp-qlikview-03ilo -OneViewHost va-oneviewt-01 0 10:59:55 WARNING: You are already connected to va-oneviewt-01</w:t>
+      </w:r>
+    </w:p>
+    <w:tbl>
+      <w:tblPr>
+        <w:tblStyle w:val="Table"/>
+        <w:tblW w:type="auto" w:w="0"/>
+        <w:tblLook w:firstRow="1" w:lastRow="0" w:firstColumn="0" w:lastColumn="0" w:noHBand="0" w:noVBand="0" w:val="0020"/>
+        <w:tblBorders>
+          <w:top w:val="single" w:sz="6" w:space="0" w:color="808080"/>
+          <w:left w:val="single" w:sz="6" w:space="0" w:color="808080"/>
+          <w:bottom w:val="single" w:sz="6" w:space="0" w:color="808080"/>
+          <w:right w:val="single" w:sz="6" w:space="0" w:color="808080"/>
+          <w:insideH w:val="single" w:sz="6" w:space="0" w:color="808080"/>
+          <w:insideV w:val="single" w:sz="6" w:space="0" w:color="808080"/>
+        </w:tblBorders>
+      </w:tblPr>
+      <w:tblGrid>
+        <w:gridCol w:w="3960"/>
+        <w:gridCol w:w="3960"/>
+      </w:tblGrid>
+      <w:tr>
+        <w:trPr>
+          <w:tblHeader w:val="on"/>
+        </w:trPr>
+        <w:tc>
+          <w:tcPr/>
+          <w:p>
+            <w:pPr>
+              <w:pStyle w:val="Compact"/>
+            </w:pPr>
+            <w:r>
+              <w:t xml:space="preserve">Name</w:t>
+            </w:r>
+          </w:p>
+        </w:tc>
+        <w:tc>
+          <w:tcPr/>
+          <w:p>
+            <w:pPr>
+              <w:pStyle w:val="Compact"/>
+            </w:pPr>
+            <w:r>
+              <w:t xml:space="preserve">Value</w:t>
+            </w:r>
+          </w:p>
+        </w:tc>
+      </w:tr>
+      <w:tr>
+        <w:tc>
+          <w:tcPr/>
+          <w:p>
+            <w:pPr>
+              <w:pStyle w:val="Compact"/>
+            </w:pPr>
+            <w:r>
+              <w:t xml:space="preserve">Total</w:t>
+            </w:r>
+          </w:p>
+        </w:tc>
+        <w:tc>
+          <w:tcPr/>
+          <w:p>
+            <w:pPr>
+              <w:pStyle w:val="Compact"/>
+            </w:pPr>
+            <w:r>
+              <w:t xml:space="preserve">1</w:t>
+            </w:r>
+          </w:p>
+        </w:tc>
+      </w:tr>
+      <w:tr>
+        <w:tc>
+          <w:tcPr/>
+          <w:p>
+            <w:pPr>
+              <w:pStyle w:val="Compact"/>
+            </w:pPr>
+            <w:r>
+              <w:t xml:space="preserve">DryRun</w:t>
+            </w:r>
+          </w:p>
+        </w:tc>
+        <w:tc>
+          <w:tcPr/>
+          <w:p>
+            <w:pPr>
+              <w:pStyle w:val="Compact"/>
+            </w:pPr>
+            <w:r>
+              <w:t xml:space="preserve">True</w:t>
+            </w:r>
+          </w:p>
+        </w:tc>
+      </w:tr>
+      <w:tr>
+        <w:tc>
+          <w:tcPr/>
+          <w:p>
+            <w:pPr>
+              <w:pStyle w:val="Compact"/>
+            </w:pPr>
+            <w:r>
+              <w:t xml:space="preserve">TargetId</w:t>
+            </w:r>
+          </w:p>
+        </w:tc>
+        <w:tc>
+          <w:tcPr/>
+          <w:p>
+            <w:pPr>
+              <w:pStyle w:val="Compact"/>
+            </w:pPr>
+            <w:r>
+              <w:t xml:space="preserve">alp-qlikview-03ilo</w:t>
+            </w:r>
+          </w:p>
+        </w:tc>
+      </w:tr>
+      <w:tr>
+        <w:tc>
+          <w:tcPr/>
+          <w:p>
+            <w:pPr>
+              <w:pStyle w:val="Compact"/>
+            </w:pPr>
+            <w:r>
+              <w:t xml:space="preserve">Objects</w:t>
+            </w:r>
+          </w:p>
+        </w:tc>
+        <w:tc>
+          <w:tcPr/>
+          <w:p>
+            <w:pPr>
+              <w:pStyle w:val="Compact"/>
+            </w:pPr>
+            <w:r>
+              <w:t xml:space="preserve">{@{Status=already_in_maintenance; Name=alp-qlikview-03ilo; Message=Already in maintenance mode; Type=server-hardware-12}}</w:t>
+            </w:r>
+          </w:p>
+        </w:tc>
+      </w:tr>
+      <w:tr>
+        <w:tc>
+          <w:tcPr/>
+          <w:p>
+            <w:pPr>
+              <w:pStyle w:val="Compact"/>
+            </w:pPr>
+            <w:r>
+              <w:t xml:space="preserve">Success</w:t>
+            </w:r>
+          </w:p>
+        </w:tc>
+        <w:tc>
+          <w:tcPr/>
+          <w:p>
+            <w:pPr>
+              <w:pStyle w:val="Compact"/>
+            </w:pPr>
+            <w:r>
+              <w:t xml:space="preserve">True</w:t>
+            </w:r>
+          </w:p>
+        </w:tc>
+      </w:tr>
+      <w:tr>
+        <w:tc>
+          <w:tcPr/>
+          <w:p>
+            <w:pPr>
+              <w:pStyle w:val="Compact"/>
+            </w:pPr>
+            <w:r>
+              <w:t xml:space="preserve">Target</w:t>
+            </w:r>
+          </w:p>
+        </w:tc>
+        <w:tc>
+          <w:tcPr/>
+          <w:p>
+            <w:pPr>
+              <w:pStyle w:val="Compact"/>
+            </w:pPr>
+            <w:r>
+              <w:t xml:space="preserve">alp-qlikview-03ilo</w:t>
+            </w:r>
+          </w:p>
+        </w:tc>
+      </w:tr>
+      <w:tr>
+        <w:tc>
+          <w:tcPr/>
+          <w:p>
+            <w:pPr>
+              <w:pStyle w:val="Compact"/>
+            </w:pPr>
+            <w:r>
+              <w:t xml:space="preserve">FailedCount</w:t>
+            </w:r>
+          </w:p>
+        </w:tc>
+        <w:tc>
+          <w:tcPr/>
+          <w:p>
+            <w:pPr>
+              <w:pStyle w:val="Compact"/>
+            </w:pPr>
+            <w:r>
+              <w:t xml:space="preserve">0</w:t>
+            </w:r>
+          </w:p>
+        </w:tc>
+      </w:tr>
+      <w:tr>
+        <w:tc>
+          <w:tcPr/>
+          <w:p>
+            <w:pPr>
+              <w:pStyle w:val="Compact"/>
+            </w:pPr>
+            <w:r>
+              <w:t xml:space="preserve">ResolvedType</w:t>
+            </w:r>
+          </w:p>
+        </w:tc>
+        <w:tc>
+          <w:tcPr/>
+          <w:p>
+            <w:pPr>
+              <w:pStyle w:val="Compact"/>
+            </w:pPr>
+            <w:r>
+              <w:t xml:space="preserve">ServerHardware</w:t>
+            </w:r>
+          </w:p>
+        </w:tc>
+      </w:tr>
+      <w:tr>
+        <w:tc>
+          <w:tcPr/>
+          <w:p>
+            <w:pPr>
+              <w:pStyle w:val="Compact"/>
+            </w:pPr>
+            <w:r>
+              <w:t xml:space="preserve">TargetType</w:t>
+            </w:r>
+          </w:p>
+        </w:tc>
+        <w:tc>
+          <w:tcPr/>
+          <w:p>
+            <w:pPr>
+              <w:pStyle w:val="Compact"/>
+            </w:pPr>
+            <w:r>
+              <w:t xml:space="preserve">ServerHardware</w:t>
+            </w:r>
+          </w:p>
+        </w:tc>
+      </w:tr>
+      <w:tr>
+        <w:tc>
+          <w:tcPr/>
+          <w:p>
+            <w:pPr>
+              <w:pStyle w:val="Compact"/>
+            </w:pPr>
+            <w:r>
+              <w:t xml:space="preserve">StartTime</w:t>
+            </w:r>
+          </w:p>
+        </w:tc>
+        <w:tc>
+          <w:tcPr/>
+          <w:p>
+            <w:pPr>
+              <w:pStyle w:val="Compact"/>
+            </w:pPr>
+            <w:r>
+              <w:t xml:space="preserve">16/09/2026 09:59:59</w:t>
+            </w:r>
+          </w:p>
+        </w:tc>
+      </w:tr>
+      <w:tr>
+        <w:tc>
+          <w:tcPr/>
+          <w:p>
+            <w:pPr>
+              <w:pStyle w:val="Compact"/>
+            </w:pPr>
+            <w:r>
+              <w:t xml:space="preserve">Message</w:t>
+            </w:r>
+          </w:p>
+        </w:tc>
+        <w:tc>
+          <w:tcPr/>
+          <w:p>
+            <w:pPr>
+              <w:pStyle w:val="Compact"/>
+            </w:pPr>
+            <w:r>
+              <w:t xml:space="preserve">OneView maintenance mode enabled: 0 succeeded, 0 failed, 1 already in maintenance (total 1)</w:t>
+            </w:r>
+          </w:p>
+        </w:tc>
+      </w:tr>
+      <w:tr>
+        <w:tc>
+          <w:tcPr/>
+          <w:p>
+            <w:pPr>
+              <w:pStyle w:val="Compact"/>
+            </w:pPr>
+            <w:r>
+              <w:t xml:space="preserve">ResolvedTarget</w:t>
+            </w:r>
+          </w:p>
+        </w:tc>
+        <w:tc>
+          <w:tcPr/>
+          <w:p>
+            <w:pPr>
+              <w:pStyle w:val="Compact"/>
+            </w:pPr>
+            <w:r>
+              <w:t xml:space="preserve">alp-qlikview-03ilo</w:t>
+            </w:r>
+          </w:p>
+        </w:tc>
+      </w:tr>
+      <w:tr>
+        <w:tc>
+          <w:tcPr/>
+          <w:p>
+            <w:pPr>
+              <w:pStyle w:val="Compact"/>
+            </w:pPr>
+            <w:r>
+              <w:t xml:space="preserve">SuccessCount</w:t>
+            </w:r>
+          </w:p>
+        </w:tc>
+        <w:tc>
+          <w:tcPr/>
+          <w:p>
+            <w:pPr>
+              <w:pStyle w:val="Compact"/>
+            </w:pPr>
+            <w:r>
+              <w:t xml:space="preserve">0</w:t>
+            </w:r>
+          </w:p>
+        </w:tc>
+      </w:tr>
+      <w:tr>
+        <w:tc>
+          <w:tcPr/>
+          <w:p>
+            <w:pPr>
+              <w:pStyle w:val="Compact"/>
+            </w:pPr>
+            <w:r>
+              <w:t xml:space="preserve">Module</w:t>
+            </w:r>
+          </w:p>
+        </w:tc>
+        <w:tc>
+          <w:tcPr/>
+          <w:p>
+            <w:pPr>
+              <w:pStyle w:val="Compact"/>
+            </w:pPr>
+            <w:r>
+              <w:t xml:space="preserve">HPEOneView.1000</w:t>
+            </w:r>
+          </w:p>
+        </w:tc>
+      </w:tr>
+      <w:tr>
+        <w:tc>
+          <w:tcPr/>
+          <w:p>
+            <w:pPr>
+              <w:pStyle w:val="Compact"/>
+            </w:pPr>
+            <w:r>
+              <w:t xml:space="preserve">EndTime</w:t>
+            </w:r>
+          </w:p>
+        </w:tc>
+        <w:tc>
+          <w:tcPr/>
+          <w:p>
+            <w:pPr>
+              <w:pStyle w:val="Compact"/>
+            </w:pPr>
+            <w:r>
+              <w:t xml:space="preserve">16/09/2026 13:59:59</w:t>
+            </w:r>
+          </w:p>
+        </w:tc>
+      </w:tr>
+      <w:tr>
+        <w:tc>
+          <w:tcPr/>
+          <w:p>
+            <w:pPr>
+              <w:pStyle w:val="Compact"/>
+            </w:pPr>
+            <w:r>
+              <w:t xml:space="preserve">SerialNumber</w:t>
+            </w:r>
+          </w:p>
+        </w:tc>
+        <w:tc>
+          <w:tcPr/>
+          <w:p>
+            <w:pPr>
+              <w:pStyle w:val="Compact"/>
+            </w:pPr>
+          </w:p>
+        </w:tc>
+      </w:tr>
+      <w:tr>
+        <w:tc>
+          <w:tcPr/>
+          <w:p>
+            <w:pPr>
+              <w:pStyle w:val="Compact"/>
+            </w:pPr>
+            <w:r>
+              <w:t xml:space="preserve">Appliance</w:t>
+            </w:r>
+          </w:p>
+        </w:tc>
+        <w:tc>
+          <w:tcPr/>
+          <w:p>
+            <w:pPr>
+              <w:pStyle w:val="Compact"/>
+            </w:pPr>
+            <w:r>
+              <w:t xml:space="preserve">va-oneviewt-01</w:t>
+            </w:r>
+          </w:p>
+        </w:tc>
+      </w:tr>
+      <w:tr>
+        <w:tc>
+          <w:tcPr/>
+          <w:p>
+            <w:pPr>
+              <w:pStyle w:val="Compact"/>
+            </w:pPr>
+            <w:r>
+              <w:t xml:space="preserve">AlreadyCount</w:t>
+            </w:r>
+          </w:p>
+        </w:tc>
+        <w:tc>
+          <w:tcPr/>
+          <w:p>
+            <w:pPr>
+              <w:pStyle w:val="Compact"/>
+            </w:pPr>
+            <w:r>
+              <w:t xml:space="preserve">1</w:t>
+            </w:r>
+          </w:p>
+        </w:tc>
+      </w:tr>
+    </w:tbl>
+    <w:bookmarkEnd w:id="177"/>
+    <w:bookmarkStart w:id="178" w:name="X193f0319952355c431bb06b880e4849a991e6ae"/>
+    <w:p>
+      <w:pPr>
+        <w:pStyle w:val="Heading1"/>
+      </w:pPr>
+      <w:r>
+        <w:t xml:space="preserve">  image-build-automation main Get-OneViewServerList -Filter</w:t>
+      </w:r>
+      <w:r>
+        <w:t xml:space="preserve"> </w:t>
+      </w:r>
+      <w:r>
+        <w:t xml:space="preserve">‘name:03ilo’</w:t>
+      </w:r>
+      <w:r>
+        <w:t xml:space="preserve"> </w:t>
+      </w:r>
+      <w:r>
+        <w:t xml:space="preserve">0 921ms 11:00:00 </w:t>
+      </w:r>
+    </w:p>
+    <w:p>
+      <w:pPr>
+        <w:pStyle w:val="FirstParagraph"/>
+      </w:pPr>
+      <w:r>
+        <w:t xml:space="preserve">OneView Server List (6 servers)</w:t>
+      </w:r>
+      <w:r>
+        <w:t xml:space="preserve"> </w:t>
+      </w:r>
+      <w:r>
+        <w:t xml:space="preserve">Appliance: va-oneviewt-01</w:t>
+      </w:r>
+      <w:r>
+        <w:t xml:space="preserve"> </w:t>
+      </w:r>
+      <w:r>
+        <w:t xml:space="preserve">==============================================</w:t>
+      </w:r>
+    </w:p>
+    <w:tbl>
+      <w:tblPr>
+        <w:tblStyle w:val="Table"/>
+        <w:tblW w:type="pct" w:w="5000"/>
+        <w:tblLayout w:type="fixed"/>
+        <w:tblLook w:firstRow="1" w:lastRow="0" w:firstColumn="0" w:lastColumn="0" w:noHBand="0" w:noVBand="0" w:val="0020"/>
+        <w:tblBorders>
+          <w:top w:val="single" w:sz="6" w:space="0" w:color="808080"/>
+          <w:left w:val="single" w:sz="6" w:space="0" w:color="808080"/>
+          <w:bottom w:val="single" w:sz="6" w:space="0" w:color="808080"/>
+          <w:right w:val="single" w:sz="6" w:space="0" w:color="808080"/>
+          <w:insideH w:val="single" w:sz="6" w:space="0" w:color="808080"/>
+          <w:insideV w:val="single" w:sz="6" w:space="0" w:color="808080"/>
+        </w:tblBorders>
+      </w:tblPr>
+      <w:tblGrid>
+        <w:gridCol w:w="1420"/>
+        <w:gridCol w:w="731"/>
+        <w:gridCol w:w="473"/>
+        <w:gridCol w:w="774"/>
+        <w:gridCol w:w="516"/>
+        <w:gridCol w:w="430"/>
+        <w:gridCol w:w="731"/>
+        <w:gridCol w:w="1033"/>
+        <w:gridCol w:w="645"/>
+        <w:gridCol w:w="1162"/>
+      </w:tblGrid>
+      <w:tr>
+        <w:trPr>
+          <w:tblHeader w:val="on"/>
+        </w:trPr>
+        <w:tc>
+          <w:tcPr/>
+          <w:p>
+            <w:pPr>
+              <w:pStyle w:val="Compact"/>
+            </w:pPr>
+            <w:r>
+              <w:t xml:space="preserve">Server Name</w:t>
+            </w:r>
+          </w:p>
+        </w:tc>
+        <w:tc>
+          <w:tcPr/>
+          <w:p>
+            <w:pPr>
+              <w:pStyle w:val="Compact"/>
+            </w:pPr>
+            <w:r>
+              <w:t xml:space="preserve">Serial</w:t>
+            </w:r>
+          </w:p>
+        </w:tc>
+        <w:tc>
+          <w:tcPr/>
+          <w:p>
+            <w:pPr>
+              <w:pStyle w:val="Compact"/>
+            </w:pPr>
+            <w:r>
+              <w:t xml:space="preserve">MaintMode</w:t>
+            </w:r>
+          </w:p>
+        </w:tc>
+        <w:tc>
+          <w:tcPr/>
+          <w:p>
+            <w:pPr>
+              <w:pStyle w:val="Compact"/>
+            </w:pPr>
+            <w:r>
+              <w:t xml:space="preserve">State</w:t>
+            </w:r>
+          </w:p>
+        </w:tc>
+        <w:tc>
+          <w:tcPr/>
+          <w:p>
+            <w:pPr>
+              <w:pStyle w:val="Compact"/>
+            </w:pPr>
+            <w:r>
+              <w:t xml:space="preserve">Health</w:t>
+            </w:r>
+          </w:p>
+        </w:tc>
+        <w:tc>
+          <w:tcPr/>
+          <w:p>
+            <w:pPr>
+              <w:pStyle w:val="Compact"/>
+            </w:pPr>
+            <w:r>
+              <w:t xml:space="preserve">Power</w:t>
+            </w:r>
+          </w:p>
+        </w:tc>
+        <w:tc>
+          <w:tcPr/>
+          <w:p>
+            <w:pPr>
+              <w:pStyle w:val="Compact"/>
+            </w:pPr>
+            <w:r>
+              <w:t xml:space="preserve">iLO IP</w:t>
+            </w:r>
+          </w:p>
+        </w:tc>
+        <w:tc>
+          <w:tcPr/>
+          <w:p>
+            <w:pPr>
+              <w:pStyle w:val="Compact"/>
+            </w:pPr>
+            <w:r>
+              <w:t xml:space="preserve">ROM</w:t>
+            </w:r>
+          </w:p>
+        </w:tc>
+        <w:tc>
+          <w:tcPr/>
+          <w:p>
+            <w:pPr>
+              <w:pStyle w:val="Compact"/>
+            </w:pPr>
+            <w:r>
+              <w:t xml:space="preserve">State Reason</w:t>
+            </w:r>
+          </w:p>
+        </w:tc>
+        <w:tc>
+          <w:tcPr/>
+          <w:p>
+            <w:pPr>
+              <w:pStyle w:val="Compact"/>
+            </w:pPr>
+            <w:r>
+              <w:t xml:space="preserve">Model</w:t>
+            </w:r>
+          </w:p>
+        </w:tc>
+      </w:tr>
+      <w:tr>
+        <w:tc>
+          <w:tcPr/>
+          <w:p>
+            <w:pPr>
+              <w:pStyle w:val="Compact"/>
+            </w:pPr>
+            <w:r>
+              <w:t xml:space="preserve">gam-isechost-02-03ilo.ad.ad.pri</w:t>
+            </w:r>
+          </w:p>
+        </w:tc>
+        <w:tc>
+          <w:tcPr/>
+          <w:p>
+            <w:pPr>
+              <w:pStyle w:val="Compact"/>
+            </w:pPr>
+            <w:r>
+              <w:t xml:space="preserve">CZ29350B60</w:t>
+            </w:r>
+          </w:p>
+        </w:tc>
+        <w:tc>
+          <w:tcPr/>
+          <w:p>
+            <w:pPr>
+              <w:pStyle w:val="Compact"/>
+            </w:pPr>
+            <w:r>
+              <w:t xml:space="preserve">No</w:t>
+            </w:r>
+          </w:p>
+        </w:tc>
+        <w:tc>
+          <w:tcPr/>
+          <w:p>
+            <w:pPr>
+              <w:pStyle w:val="Compact"/>
+            </w:pPr>
+            <w:r>
+              <w:t xml:space="preserve">NoProfileApplied</w:t>
+            </w:r>
+          </w:p>
+        </w:tc>
+        <w:tc>
+          <w:tcPr/>
+          <w:p>
+            <w:pPr>
+              <w:pStyle w:val="Compact"/>
+            </w:pPr>
+            <w:r>
+              <w:t xml:space="preserve">OK</w:t>
+            </w:r>
+          </w:p>
+        </w:tc>
+        <w:tc>
+          <w:tcPr/>
+          <w:p>
+            <w:pPr>
+              <w:pStyle w:val="Compact"/>
+            </w:pPr>
+            <w:r>
+              <w:t xml:space="preserve">On</w:t>
+            </w:r>
+          </w:p>
+        </w:tc>
+        <w:tc>
+          <w:tcPr/>
+          <w:p>
+            <w:pPr>
+              <w:pStyle w:val="Compact"/>
+            </w:pPr>
+            <w:r>
+              <w:t xml:space="preserve">10.30.14.83</w:t>
+            </w:r>
+          </w:p>
+        </w:tc>
+        <w:tc>
+          <w:tcPr/>
+          <w:p>
+            <w:pPr>
+              <w:pStyle w:val="Compact"/>
+            </w:pPr>
+            <w:r>
+              <w:t xml:space="preserve">U30 v3.42 (02/21/2025)</w:t>
+            </w:r>
+          </w:p>
+        </w:tc>
+        <w:tc>
+          <w:tcPr/>
+          <w:p>
+            <w:pPr>
+              <w:pStyle w:val="Compact"/>
+            </w:pPr>
+          </w:p>
+        </w:tc>
+        <w:tc>
+          <w:tcPr/>
+          <w:p>
+            <w:pPr>
+              <w:pStyle w:val="Compact"/>
+            </w:pPr>
+            <w:r>
+              <w:t xml:space="preserve">ProLiant DL380 Gen10</w:t>
+            </w:r>
+          </w:p>
+        </w:tc>
+      </w:tr>
+      <w:tr>
+        <w:tc>
+          <w:tcPr/>
+          <w:p>
+            <w:pPr>
+              <w:pStyle w:val="Compact"/>
+            </w:pPr>
+            <w:r>
+              <w:t xml:space="preserve">gamdmzhost-01-03ilo.AD.AIB.PRI</w:t>
+            </w:r>
+          </w:p>
+        </w:tc>
+        <w:tc>
+          <w:tcPr/>
+          <w:p>
+            <w:pPr>
+              <w:pStyle w:val="Compact"/>
+            </w:pPr>
+            <w:r>
+              <w:t xml:space="preserve">CZ29350B5Y</w:t>
+            </w:r>
+          </w:p>
+        </w:tc>
+        <w:tc>
+          <w:tcPr/>
+          <w:p>
+            <w:pPr>
+              <w:pStyle w:val="Compact"/>
+            </w:pPr>
+            <w:r>
+              <w:t xml:space="preserve">No</w:t>
+            </w:r>
+          </w:p>
+        </w:tc>
+        <w:tc>
+          <w:tcPr/>
+          <w:p>
+            <w:pPr>
+              <w:pStyle w:val="Compact"/>
+            </w:pPr>
+            <w:r>
+              <w:t xml:space="preserve">NoProfileApplied</w:t>
+            </w:r>
+          </w:p>
+        </w:tc>
+        <w:tc>
+          <w:tcPr/>
+          <w:p>
+            <w:pPr>
+              <w:pStyle w:val="Compact"/>
+            </w:pPr>
+            <w:r>
+              <w:t xml:space="preserve">OK</w:t>
+            </w:r>
+          </w:p>
+        </w:tc>
+        <w:tc>
+          <w:tcPr/>
+          <w:p>
+            <w:pPr>
+              <w:pStyle w:val="Compact"/>
+            </w:pPr>
+            <w:r>
+              <w:t xml:space="preserve">On</w:t>
+            </w:r>
+          </w:p>
+        </w:tc>
+        <w:tc>
+          <w:tcPr/>
+          <w:p>
+            <w:pPr>
+              <w:pStyle w:val="Compact"/>
+            </w:pPr>
+            <w:r>
+              <w:t xml:space="preserve">10.30.14.80</w:t>
+            </w:r>
+          </w:p>
+        </w:tc>
+        <w:tc>
+          <w:tcPr/>
+          <w:p>
+            <w:pPr>
+              <w:pStyle w:val="Compact"/>
+            </w:pPr>
+            <w:r>
+              <w:t xml:space="preserve">U30 v3.42 (02/21/2025)</w:t>
+            </w:r>
+          </w:p>
+        </w:tc>
+        <w:tc>
+          <w:tcPr/>
+          <w:p>
+            <w:pPr>
+              <w:pStyle w:val="Compact"/>
+            </w:pPr>
+          </w:p>
+        </w:tc>
+        <w:tc>
+          <w:tcPr/>
+          <w:p>
+            <w:pPr>
+              <w:pStyle w:val="Compact"/>
+            </w:pPr>
+            <w:r>
+              <w:t xml:space="preserve">ProLiant DL380 Gen10</w:t>
+            </w:r>
+          </w:p>
+        </w:tc>
+      </w:tr>
+      <w:tr>
+        <w:tc>
+          <w:tcPr/>
+          <w:p>
+            <w:pPr>
+              <w:pStyle w:val="Compact"/>
+            </w:pPr>
+            <w:r>
+              <w:t xml:space="preserve">gamdmzhost-02-03ilo</w:t>
+            </w:r>
+          </w:p>
+        </w:tc>
+        <w:tc>
+          <w:tcPr/>
+          <w:p>
+            <w:pPr>
+              <w:pStyle w:val="Compact"/>
+            </w:pPr>
+            <w:r>
+              <w:t xml:space="preserve">CZ29350B5Z</w:t>
+            </w:r>
+          </w:p>
+        </w:tc>
+        <w:tc>
+          <w:tcPr/>
+          <w:p>
+            <w:pPr>
+              <w:pStyle w:val="Compact"/>
+            </w:pPr>
+            <w:r>
+              <w:t xml:space="preserve">No</w:t>
+            </w:r>
+          </w:p>
+        </w:tc>
+        <w:tc>
+          <w:tcPr/>
+          <w:p>
+            <w:pPr>
+              <w:pStyle w:val="Compact"/>
+            </w:pPr>
+            <w:r>
+              <w:t xml:space="preserve">NoProfileApplied</w:t>
+            </w:r>
+          </w:p>
+        </w:tc>
+        <w:tc>
+          <w:tcPr/>
+          <w:p>
+            <w:pPr>
+              <w:pStyle w:val="Compact"/>
+            </w:pPr>
+            <w:r>
+              <w:t xml:space="preserve">OK</w:t>
+            </w:r>
+          </w:p>
+        </w:tc>
+        <w:tc>
+          <w:tcPr/>
+          <w:p>
+            <w:pPr>
+              <w:pStyle w:val="Compact"/>
+            </w:pPr>
+            <w:r>
+              <w:t xml:space="preserve">On</w:t>
+            </w:r>
+          </w:p>
+        </w:tc>
+        <w:tc>
+          <w:tcPr/>
+          <w:p>
+            <w:pPr>
+              <w:pStyle w:val="Compact"/>
+            </w:pPr>
+            <w:r>
+              <w:t xml:space="preserve">10.30.14.81</w:t>
+            </w:r>
+          </w:p>
+        </w:tc>
+        <w:tc>
+          <w:tcPr/>
+          <w:p>
+            <w:pPr>
+              <w:pStyle w:val="Compact"/>
+            </w:pPr>
+            <w:r>
+              <w:t xml:space="preserve">U30 v3.42 (02/21/2025)</w:t>
+            </w:r>
+          </w:p>
+        </w:tc>
+        <w:tc>
+          <w:tcPr/>
+          <w:p>
+            <w:pPr>
+              <w:pStyle w:val="Compact"/>
+            </w:pPr>
+          </w:p>
+        </w:tc>
+        <w:tc>
+          <w:tcPr/>
+          <w:p>
+            <w:pPr>
+              <w:pStyle w:val="Compact"/>
+            </w:pPr>
+            <w:r>
+              <w:t xml:space="preserve">ProLiant DL380 Gen10</w:t>
+            </w:r>
+          </w:p>
+        </w:tc>
+      </w:tr>
+      <w:tr>
+        <w:tc>
+          <w:tcPr/>
+          <w:p>
+            <w:pPr>
+              <w:pStyle w:val="Compact"/>
+            </w:pPr>
+            <w:r>
+              <w:t xml:space="preserve">gamisechost-01-03ilo.AD.AIB.PRI</w:t>
+            </w:r>
+          </w:p>
+        </w:tc>
+        <w:tc>
+          <w:tcPr/>
+          <w:p>
+            <w:pPr>
+              <w:pStyle w:val="Compact"/>
+            </w:pPr>
+            <w:r>
+              <w:t xml:space="preserve">CZ29350B61</w:t>
+            </w:r>
+          </w:p>
+        </w:tc>
+        <w:tc>
+          <w:tcPr/>
+          <w:p>
+            <w:pPr>
+              <w:pStyle w:val="Compact"/>
+            </w:pPr>
+            <w:r>
+              <w:t xml:space="preserve">No</w:t>
+            </w:r>
+          </w:p>
+        </w:tc>
+        <w:tc>
+          <w:tcPr/>
+          <w:p>
+            <w:pPr>
+              <w:pStyle w:val="Compact"/>
+            </w:pPr>
+            <w:r>
+              <w:t xml:space="preserve">NoProfileApplied</w:t>
+            </w:r>
+          </w:p>
+        </w:tc>
+        <w:tc>
+          <w:tcPr/>
+          <w:p>
+            <w:pPr>
+              <w:pStyle w:val="Compact"/>
+            </w:pPr>
+            <w:r>
+              <w:t xml:space="preserve">Critical</w:t>
+            </w:r>
+          </w:p>
+        </w:tc>
+        <w:tc>
+          <w:tcPr/>
+          <w:p>
+            <w:pPr>
+              <w:pStyle w:val="Compact"/>
+            </w:pPr>
+            <w:r>
+              <w:t xml:space="preserve">On</w:t>
+            </w:r>
+          </w:p>
+        </w:tc>
+        <w:tc>
+          <w:tcPr/>
+          <w:p>
+            <w:pPr>
+              <w:pStyle w:val="Compact"/>
+            </w:pPr>
+            <w:r>
+              <w:t xml:space="preserve">10.30.14.82</w:t>
+            </w:r>
+          </w:p>
+        </w:tc>
+        <w:tc>
+          <w:tcPr/>
+          <w:p>
+            <w:pPr>
+              <w:pStyle w:val="Compact"/>
+            </w:pPr>
+            <w:r>
+              <w:t xml:space="preserve">U30 v3.42 (02/21/2025)</w:t>
+            </w:r>
+          </w:p>
+        </w:tc>
+        <w:tc>
+          <w:tcPr/>
+          <w:p>
+            <w:pPr>
+              <w:pStyle w:val="Compact"/>
+            </w:pPr>
+          </w:p>
+        </w:tc>
+        <w:tc>
+          <w:tcPr/>
+          <w:p>
+            <w:pPr>
+              <w:pStyle w:val="Compact"/>
+            </w:pPr>
+            <w:r>
+              <w:t xml:space="preserve">ProLiant DL380 Gen10</w:t>
+            </w:r>
+          </w:p>
+        </w:tc>
+      </w:tr>
+      <w:tr>
+        <w:tc>
+          <w:tcPr/>
+          <w:p>
+            <w:pPr>
+              <w:pStyle w:val="Compact"/>
+            </w:pPr>
+            <w:r>
+              <w:t xml:space="preserve">alp-qlikview-03ilo</w:t>
+            </w:r>
+          </w:p>
+        </w:tc>
+        <w:tc>
+          <w:tcPr/>
+          <w:p>
+            <w:pPr>
+              <w:pStyle w:val="Compact"/>
+            </w:pPr>
+            <w:r>
+              <w:t xml:space="preserve">CZ22420JCM</w:t>
+            </w:r>
+          </w:p>
+        </w:tc>
+        <w:tc>
+          <w:tcPr/>
+          <w:p>
+            <w:pPr>
+              <w:pStyle w:val="Compact"/>
+            </w:pPr>
+            <w:r>
+              <w:t xml:space="preserve">No</w:t>
+            </w:r>
+          </w:p>
+        </w:tc>
+        <w:tc>
+          <w:tcPr/>
+          <w:p>
+            <w:pPr>
+              <w:pStyle w:val="Compact"/>
+            </w:pPr>
+            <w:r>
+              <w:t xml:space="preserve">NoProfileApplied</w:t>
+            </w:r>
+          </w:p>
+        </w:tc>
+        <w:tc>
+          <w:tcPr/>
+          <w:p>
+            <w:pPr>
+              <w:pStyle w:val="Compact"/>
+            </w:pPr>
+            <w:r>
+              <w:t xml:space="preserve">OK</w:t>
+            </w:r>
+          </w:p>
+        </w:tc>
+        <w:tc>
+          <w:tcPr/>
+          <w:p>
+            <w:pPr>
+              <w:pStyle w:val="Compact"/>
+            </w:pPr>
+            <w:r>
+              <w:t xml:space="preserve">On</w:t>
+            </w:r>
+          </w:p>
+        </w:tc>
+        <w:tc>
+          <w:tcPr/>
+          <w:p>
+            <w:pPr>
+              <w:pStyle w:val="Compact"/>
+            </w:pPr>
+            <w:r>
+              <w:t xml:space="preserve">10.30.14.15</w:t>
+            </w:r>
+          </w:p>
+        </w:tc>
+        <w:tc>
+          <w:tcPr/>
+          <w:p>
+            <w:pPr>
+              <w:pStyle w:val="Compact"/>
+            </w:pPr>
+            <w:r>
+              <w:t xml:space="preserve">U46 v2.42 (06/13/2025)</w:t>
+            </w:r>
+          </w:p>
+        </w:tc>
+        <w:tc>
+          <w:tcPr/>
+          <w:p>
+            <w:pPr>
+              <w:pStyle w:val="Compact"/>
+            </w:pPr>
+          </w:p>
+        </w:tc>
+        <w:tc>
+          <w:tcPr/>
+          <w:p>
+            <w:pPr>
+              <w:pStyle w:val="Compact"/>
+            </w:pPr>
+            <w:r>
+              <w:t xml:space="preserve">ProLiant DL360 Gen10 Plus</w:t>
+            </w:r>
+          </w:p>
+        </w:tc>
+      </w:tr>
+      <w:tr>
+        <w:tc>
+          <w:tcPr/>
+          <w:p>
+            <w:pPr>
+              <w:pStyle w:val="Compact"/>
+            </w:pPr>
+            <w:r>
+              <w:t xml:space="preserve">omg-qlikview-03ilo</w:t>
+            </w:r>
+          </w:p>
+        </w:tc>
+        <w:tc>
+          <w:tcPr/>
+          <w:p>
+            <w:pPr>
+              <w:pStyle w:val="Compact"/>
+            </w:pPr>
+            <w:r>
+              <w:t xml:space="preserve">CZ22420JCN</w:t>
+            </w:r>
+          </w:p>
+        </w:tc>
+        <w:tc>
+          <w:tcPr/>
+          <w:p>
+            <w:pPr>
+              <w:pStyle w:val="Compact"/>
+            </w:pPr>
+            <w:r>
+              <w:t xml:space="preserve">No</w:t>
+            </w:r>
+          </w:p>
+        </w:tc>
+        <w:tc>
+          <w:tcPr/>
+          <w:p>
+            <w:pPr>
+              <w:pStyle w:val="Compact"/>
+            </w:pPr>
+            <w:r>
+              <w:t xml:space="preserve">NoProfileApplied</w:t>
+            </w:r>
+          </w:p>
+        </w:tc>
+        <w:tc>
+          <w:tcPr/>
+          <w:p>
+            <w:pPr>
+              <w:pStyle w:val="Compact"/>
+            </w:pPr>
+            <w:r>
+              <w:t xml:space="preserve">OK</w:t>
+            </w:r>
+          </w:p>
+        </w:tc>
+        <w:tc>
+          <w:tcPr/>
+          <w:p>
+            <w:pPr>
+              <w:pStyle w:val="Compact"/>
+            </w:pPr>
+            <w:r>
+              <w:t xml:space="preserve">On</w:t>
+            </w:r>
+          </w:p>
+        </w:tc>
+        <w:tc>
+          <w:tcPr/>
+          <w:p>
+            <w:pPr>
+              <w:pStyle w:val="Compact"/>
+            </w:pPr>
+            <w:r>
+              <w:t xml:space="preserve">10.30.54.22</w:t>
+            </w:r>
+          </w:p>
+        </w:tc>
+        <w:tc>
+          <w:tcPr/>
+          <w:p>
+            <w:pPr>
+              <w:pStyle w:val="Compact"/>
+            </w:pPr>
+            <w:r>
+              <w:t xml:space="preserve">U46 v2.42 (06/13/2025)</w:t>
+            </w:r>
+          </w:p>
+        </w:tc>
+        <w:tc>
+          <w:tcPr/>
+          <w:p>
+            <w:pPr>
+              <w:pStyle w:val="Compact"/>
+            </w:pPr>
+          </w:p>
+        </w:tc>
+        <w:tc>
+          <w:tcPr/>
+          <w:p>
+            <w:pPr>
+              <w:pStyle w:val="Compact"/>
+            </w:pPr>
+            <w:r>
+              <w:t xml:space="preserve">ProLiant DL360 Gen10 Plus</w:t>
+            </w:r>
+          </w:p>
+        </w:tc>
+      </w:tr>
+    </w:tbl>
+    <w:p>
+      <w:pPr>
+        <w:pStyle w:val="BodyText"/>
+      </w:pPr>
+      <w:r>
+        <w:t xml:space="preserve">KEY</w:t>
+      </w:r>
+      <w:r>
+        <w:t xml:space="preserve"> </w:t>
+      </w:r>
+      <w:r>
+        <w:t xml:space="preserve">MaintMode : HPE OneView maintenance mode. Yes = server is IN maintenance mode; No = NOT in maintenance mode.</w:t>
+      </w:r>
+      <w:r>
+        <w:t xml:space="preserve"> </w:t>
+      </w:r>
+      <w:r>
+        <w:t xml:space="preserve">State : server lifecycle state from OneView:</w:t>
+      </w:r>
+      <w:r>
+        <w:t xml:space="preserve"> </w:t>
+      </w:r>
+      <w:r>
+        <w:t xml:space="preserve">Monitored = normal / being monitored (not in maintenance)</w:t>
+      </w:r>
+      <w:r>
+        <w:t xml:space="preserve"> </w:t>
+      </w:r>
+      <w:r>
+        <w:t xml:space="preserve">MaintenanceMode = same as MaintMode=Yes (server placed in maintenance)</w:t>
+      </w:r>
+      <w:r>
+        <w:t xml:space="preserve"> </w:t>
+      </w:r>
+      <w:r>
+        <w:t xml:space="preserve">NoProfileApplied = no server profile assigned</w:t>
+      </w:r>
+      <w:r>
+        <w:t xml:space="preserve"> </w:t>
+      </w:r>
+      <w:r>
+        <w:t xml:space="preserve">ProfileApplying = a server profile is being applied</w:t>
+      </w:r>
+      <w:r>
+        <w:t xml:space="preserve"> </w:t>
+      </w:r>
+      <w:r>
+        <w:t xml:space="preserve">ProfileApplied = a server profile has been applied</w:t>
+      </w:r>
+      <w:r>
+        <w:t xml:space="preserve"> </w:t>
+      </w:r>
+      <w:r>
+        <w:t xml:space="preserve">ConfigureHardware = hardware configuration in progress</w:t>
+      </w:r>
+      <w:r>
+        <w:t xml:space="preserve"> </w:t>
+      </w:r>
+      <w:r>
+        <w:t xml:space="preserve">ProfileError = profile apply failed (NOT maintenance)</w:t>
+      </w:r>
+      <w:r>
+        <w:t xml:space="preserve"> </w:t>
+      </w:r>
+      <w:r>
+        <w:t xml:space="preserve">Deleting = server being removed</w:t>
+      </w:r>
+      <w:r>
+        <w:t xml:space="preserve"> </w:t>
+      </w:r>
+      <w:r>
+        <w:t xml:space="preserve">State Reason : additional context for the State value (blank when</w:t>
+      </w:r>
+      <w:r>
+        <w:t xml:space="preserve"> </w:t>
+      </w:r>
+      <w:r>
+        <w:t xml:space="preserve">‘NotApplicable’</w:t>
+      </w:r>
+      <w:r>
+        <w:t xml:space="preserve">):</w:t>
+      </w:r>
+      <w:r>
+        <w:t xml:space="preserve"> </w:t>
+      </w:r>
+      <w:r>
+        <w:t xml:space="preserve">NotApplicable = no special reason; state is self-explanatory (shown as blank)</w:t>
+      </w:r>
+      <w:r>
+        <w:t xml:space="preserve"> </w:t>
+      </w:r>
+      <w:r>
+        <w:t xml:space="preserve">UserInitiated = state change triggered by a user action</w:t>
+      </w:r>
+      <w:r>
+        <w:t xml:space="preserve"> </w:t>
+      </w:r>
+      <w:r>
+        <w:t xml:space="preserve">Unmanaged = hardware not managed by this OneView appliance</w:t>
+      </w:r>
+      <w:r>
+        <w:t xml:space="preserve"> </w:t>
+      </w:r>
+      <w:r>
+        <w:t xml:space="preserve">Removed = hardware has been removed from the appliance</w:t>
+      </w:r>
+    </w:p>
+    <w:p>
+      <w:pPr>
+        <w:pStyle w:val="BodyText"/>
+      </w:pPr>
+      <w:r>
+        <w:t xml:space="preserve">==============================================</w:t>
+      </w:r>
+    </w:p>
+    <w:bookmarkEnd w:id="178"/>
     <w:sectPr>
       <w:pgSz w:w="16838" w:h="11906" w:orient="landscape"/>
       <w:footnotePr>

</xml_diff>